<commit_message>
added UML to Tech doc
</commit_message>
<xml_diff>
--- a/CS2050FinalProject/Drone Delivery Hangar Technical Documentation.docx
+++ b/CS2050FinalProject/Drone Delivery Hangar Technical Documentation.docx
@@ -77,7 +77,7 @@
       <w:r>
         <w:fldChar w:fldCharType="separate"/>
       </w:r>
-      <w:hyperlink w:anchor="_Toc228460194" w:history="1">
+      <w:hyperlink w:anchor="_Toc228464079" w:history="1">
         <w:r>
           <w:rPr>
             <w:rStyle w:val="Hyperlink"/>
@@ -105,7 +105,7 @@
             <w:noProof/>
             <w:webHidden/>
           </w:rPr>
-          <w:instrText xml:space="preserve"> PAGEREF _Toc228460194 \h </w:instrText>
+          <w:instrText xml:space="preserve"> PAGEREF _Toc228464079 \h </w:instrText>
         </w:r>
         <w:r>
           <w:rPr>
@@ -153,7 +153,7 @@
           <w14:ligatures w14:val="standardContextual"/>
         </w:rPr>
       </w:pPr>
-      <w:hyperlink w:anchor="_Toc228460195" w:history="1">
+      <w:hyperlink w:anchor="_Toc228464080" w:history="1">
         <w:r>
           <w:rPr>
             <w:rStyle w:val="Hyperlink"/>
@@ -181,84 +181,7 @@
             <w:noProof/>
             <w:webHidden/>
           </w:rPr>
-          <w:instrText xml:space="preserve"> PAGEREF _Toc228460195 \h </w:instrText>
-        </w:r>
-        <w:r>
-          <w:rPr>
-            <w:noProof/>
-            <w:webHidden/>
-          </w:rPr>
-        </w:r>
-        <w:r>
-          <w:rPr>
-            <w:noProof/>
-            <w:webHidden/>
-          </w:rPr>
-          <w:fldChar w:fldCharType="separate"/>
-        </w:r>
-        <w:r>
-          <w:rPr>
-            <w:noProof/>
-            <w:webHidden/>
-          </w:rPr>
-          <w:t>2</w:t>
-        </w:r>
-        <w:r>
-          <w:rPr>
-            <w:noProof/>
-            <w:webHidden/>
-          </w:rPr>
-          <w:fldChar w:fldCharType="end"/>
-        </w:r>
-      </w:hyperlink>
-    </w:p>
-    <w:p>
-      <w:pPr>
-        <w:pStyle w:val="TOC1"/>
-        <w:tabs>
-          <w:tab w:val="right" w:pos="14390"/>
-        </w:tabs>
-        <w:rPr>
-          <w:b w:val="0"/>
-          <w:bCs w:val="0"/>
-          <w:caps w:val="0"/>
-          <w:noProof/>
-          <w:kern w:val="2"/>
-          <w:sz w:val="24"/>
-          <w:szCs w:val="24"/>
-          <w:u w:val="none"/>
-          <w14:ligatures w14:val="standardContextual"/>
-        </w:rPr>
-      </w:pPr>
-      <w:hyperlink w:anchor="_Toc228460196" w:history="1">
-        <w:r>
-          <w:rPr>
-            <w:rStyle w:val="Hyperlink"/>
-            <w:rFonts w:ascii="Arial" w:hAnsi="Arial"/>
-            <w:noProof/>
-          </w:rPr>
-          <w:t>2. Data Structure Decisions</w:t>
-        </w:r>
-        <w:r>
-          <w:rPr>
-            <w:noProof/>
-            <w:webHidden/>
-          </w:rPr>
-          <w:tab/>
-        </w:r>
-        <w:r>
-          <w:rPr>
-            <w:noProof/>
-            <w:webHidden/>
-          </w:rPr>
-          <w:fldChar w:fldCharType="begin"/>
-        </w:r>
-        <w:r>
-          <w:rPr>
-            <w:noProof/>
-            <w:webHidden/>
-          </w:rPr>
-          <w:instrText xml:space="preserve"> PAGEREF _Toc228460196 \h </w:instrText>
+          <w:instrText xml:space="preserve"> PAGEREF _Toc228464080 \h </w:instrText>
         </w:r>
         <w:r>
           <w:rPr>
@@ -306,14 +229,13 @@
           <w14:ligatures w14:val="standardContextual"/>
         </w:rPr>
       </w:pPr>
-      <w:hyperlink w:anchor="_Toc228460197" w:history="1">
+      <w:hyperlink w:anchor="_Toc228464081" w:history="1">
         <w:r>
           <w:rPr>
             <w:rStyle w:val="Hyperlink"/>
-            <w:rFonts w:ascii="Arial" w:hAnsi="Arial"/>
             <w:noProof/>
           </w:rPr>
-          <w:t>ArrayList&lt;Drone&gt;</w:t>
+          <w:t>UML Design</w:t>
         </w:r>
         <w:r>
           <w:rPr>
@@ -334,312 +256,7 @@
             <w:noProof/>
             <w:webHidden/>
           </w:rPr>
-          <w:instrText xml:space="preserve"> PAGEREF _Toc228460197 \h </w:instrText>
-        </w:r>
-        <w:r>
-          <w:rPr>
-            <w:noProof/>
-            <w:webHidden/>
-          </w:rPr>
-        </w:r>
-        <w:r>
-          <w:rPr>
-            <w:noProof/>
-            <w:webHidden/>
-          </w:rPr>
-          <w:fldChar w:fldCharType="separate"/>
-        </w:r>
-        <w:r>
-          <w:rPr>
-            <w:noProof/>
-            <w:webHidden/>
-          </w:rPr>
-          <w:t>2</w:t>
-        </w:r>
-        <w:r>
-          <w:rPr>
-            <w:noProof/>
-            <w:webHidden/>
-          </w:rPr>
-          <w:fldChar w:fldCharType="end"/>
-        </w:r>
-      </w:hyperlink>
-    </w:p>
-    <w:p>
-      <w:pPr>
-        <w:pStyle w:val="TOC2"/>
-        <w:tabs>
-          <w:tab w:val="right" w:pos="14390"/>
-        </w:tabs>
-        <w:rPr>
-          <w:b w:val="0"/>
-          <w:bCs w:val="0"/>
-          <w:smallCaps w:val="0"/>
-          <w:noProof/>
-          <w:kern w:val="2"/>
-          <w:sz w:val="24"/>
-          <w:szCs w:val="24"/>
-          <w14:ligatures w14:val="standardContextual"/>
-        </w:rPr>
-      </w:pPr>
-      <w:hyperlink w:anchor="_Toc228460198" w:history="1">
-        <w:r>
-          <w:rPr>
-            <w:rStyle w:val="Hyperlink"/>
-            <w:rFonts w:ascii="Arial" w:hAnsi="Arial"/>
-            <w:noProof/>
-          </w:rPr>
-          <w:t>HashMap&lt;String, Drone&gt;</w:t>
-        </w:r>
-        <w:r>
-          <w:rPr>
-            <w:noProof/>
-            <w:webHidden/>
-          </w:rPr>
-          <w:tab/>
-        </w:r>
-        <w:r>
-          <w:rPr>
-            <w:noProof/>
-            <w:webHidden/>
-          </w:rPr>
-          <w:fldChar w:fldCharType="begin"/>
-        </w:r>
-        <w:r>
-          <w:rPr>
-            <w:noProof/>
-            <w:webHidden/>
-          </w:rPr>
-          <w:instrText xml:space="preserve"> PAGEREF _Toc228460198 \h </w:instrText>
-        </w:r>
-        <w:r>
-          <w:rPr>
-            <w:noProof/>
-            <w:webHidden/>
-          </w:rPr>
-        </w:r>
-        <w:r>
-          <w:rPr>
-            <w:noProof/>
-            <w:webHidden/>
-          </w:rPr>
-          <w:fldChar w:fldCharType="separate"/>
-        </w:r>
-        <w:r>
-          <w:rPr>
-            <w:noProof/>
-            <w:webHidden/>
-          </w:rPr>
-          <w:t>2</w:t>
-        </w:r>
-        <w:r>
-          <w:rPr>
-            <w:noProof/>
-            <w:webHidden/>
-          </w:rPr>
-          <w:fldChar w:fldCharType="end"/>
-        </w:r>
-      </w:hyperlink>
-    </w:p>
-    <w:p>
-      <w:pPr>
-        <w:pStyle w:val="TOC2"/>
-        <w:tabs>
-          <w:tab w:val="right" w:pos="14390"/>
-        </w:tabs>
-        <w:rPr>
-          <w:b w:val="0"/>
-          <w:bCs w:val="0"/>
-          <w:smallCaps w:val="0"/>
-          <w:noProof/>
-          <w:kern w:val="2"/>
-          <w:sz w:val="24"/>
-          <w:szCs w:val="24"/>
-          <w14:ligatures w14:val="standardContextual"/>
-        </w:rPr>
-      </w:pPr>
-      <w:hyperlink w:anchor="_Toc228460199" w:history="1">
-        <w:r>
-          <w:rPr>
-            <w:rStyle w:val="Hyperlink"/>
-            <w:rFonts w:ascii="Arial" w:hAnsi="Arial"/>
-            <w:noProof/>
-          </w:rPr>
-          <w:t>Queue&lt;Drone&gt; using LinkedList</w:t>
-        </w:r>
-        <w:r>
-          <w:rPr>
-            <w:noProof/>
-            <w:webHidden/>
-          </w:rPr>
-          <w:tab/>
-        </w:r>
-        <w:r>
-          <w:rPr>
-            <w:noProof/>
-            <w:webHidden/>
-          </w:rPr>
-          <w:fldChar w:fldCharType="begin"/>
-        </w:r>
-        <w:r>
-          <w:rPr>
-            <w:noProof/>
-            <w:webHidden/>
-          </w:rPr>
-          <w:instrText xml:space="preserve"> PAGEREF _Toc228460199 \h </w:instrText>
-        </w:r>
-        <w:r>
-          <w:rPr>
-            <w:noProof/>
-            <w:webHidden/>
-          </w:rPr>
-        </w:r>
-        <w:r>
-          <w:rPr>
-            <w:noProof/>
-            <w:webHidden/>
-          </w:rPr>
-          <w:fldChar w:fldCharType="separate"/>
-        </w:r>
-        <w:r>
-          <w:rPr>
-            <w:noProof/>
-            <w:webHidden/>
-          </w:rPr>
-          <w:t>2</w:t>
-        </w:r>
-        <w:r>
-          <w:rPr>
-            <w:noProof/>
-            <w:webHidden/>
-          </w:rPr>
-          <w:fldChar w:fldCharType="end"/>
-        </w:r>
-      </w:hyperlink>
-    </w:p>
-    <w:p>
-      <w:pPr>
-        <w:pStyle w:val="TOC1"/>
-        <w:tabs>
-          <w:tab w:val="right" w:pos="14390"/>
-        </w:tabs>
-        <w:rPr>
-          <w:b w:val="0"/>
-          <w:bCs w:val="0"/>
-          <w:caps w:val="0"/>
-          <w:noProof/>
-          <w:kern w:val="2"/>
-          <w:sz w:val="24"/>
-          <w:szCs w:val="24"/>
-          <w:u w:val="none"/>
-          <w14:ligatures w14:val="standardContextual"/>
-        </w:rPr>
-      </w:pPr>
-      <w:hyperlink w:anchor="_Toc228460200" w:history="1">
-        <w:r>
-          <w:rPr>
-            <w:rStyle w:val="Hyperlink"/>
-            <w:rFonts w:ascii="Arial" w:hAnsi="Arial"/>
-            <w:noProof/>
-          </w:rPr>
-          <w:t>3. Data Structure Comparison: ArrayList-Based Queue vs Queue Using LinkedList</w:t>
-        </w:r>
-        <w:r>
-          <w:rPr>
-            <w:noProof/>
-            <w:webHidden/>
-          </w:rPr>
-          <w:tab/>
-        </w:r>
-        <w:r>
-          <w:rPr>
-            <w:noProof/>
-            <w:webHidden/>
-          </w:rPr>
-          <w:fldChar w:fldCharType="begin"/>
-        </w:r>
-        <w:r>
-          <w:rPr>
-            <w:noProof/>
-            <w:webHidden/>
-          </w:rPr>
-          <w:instrText xml:space="preserve"> PAGEREF _Toc228460200 \h </w:instrText>
-        </w:r>
-        <w:r>
-          <w:rPr>
-            <w:noProof/>
-            <w:webHidden/>
-          </w:rPr>
-        </w:r>
-        <w:r>
-          <w:rPr>
-            <w:noProof/>
-            <w:webHidden/>
-          </w:rPr>
-          <w:fldChar w:fldCharType="separate"/>
-        </w:r>
-        <w:r>
-          <w:rPr>
-            <w:noProof/>
-            <w:webHidden/>
-          </w:rPr>
-          <w:t>2</w:t>
-        </w:r>
-        <w:r>
-          <w:rPr>
-            <w:noProof/>
-            <w:webHidden/>
-          </w:rPr>
-          <w:fldChar w:fldCharType="end"/>
-        </w:r>
-      </w:hyperlink>
-    </w:p>
-    <w:p>
-      <w:pPr>
-        <w:pStyle w:val="TOC2"/>
-        <w:tabs>
-          <w:tab w:val="right" w:pos="14390"/>
-        </w:tabs>
-        <w:rPr>
-          <w:b w:val="0"/>
-          <w:bCs w:val="0"/>
-          <w:smallCaps w:val="0"/>
-          <w:noProof/>
-          <w:kern w:val="2"/>
-          <w:sz w:val="24"/>
-          <w:szCs w:val="24"/>
-          <w14:ligatures w14:val="standardContextual"/>
-        </w:rPr>
-      </w:pPr>
-      <w:hyperlink w:anchor="_Toc228460201" w:history="1">
-        <w:r>
-          <w:rPr>
-            <w:rStyle w:val="Hyperlink"/>
-            <w:rFonts w:ascii="Arial" w:hAnsi="Arial"/>
-            <w:noProof/>
-          </w:rPr>
-          <w:t>Visual Representation</w:t>
-        </w:r>
-        <w:r>
-          <w:rPr>
-            <w:noProof/>
-            <w:webHidden/>
-          </w:rPr>
-          <w:tab/>
-        </w:r>
-        <w:r>
-          <w:rPr>
-            <w:noProof/>
-            <w:webHidden/>
-          </w:rPr>
-          <w:fldChar w:fldCharType="begin"/>
-        </w:r>
-        <w:r>
-          <w:rPr>
-            <w:noProof/>
-            <w:webHidden/>
-          </w:rPr>
-          <w:instrText xml:space="preserve"> PAGEREF _Toc228460201 \h </w:instrText>
+          <w:instrText xml:space="preserve"> PAGEREF _Toc228464081 \h </w:instrText>
         </w:r>
         <w:r>
           <w:rPr>
@@ -688,14 +305,14 @@
           <w14:ligatures w14:val="standardContextual"/>
         </w:rPr>
       </w:pPr>
-      <w:hyperlink w:anchor="_Toc228460202" w:history="1">
+      <w:hyperlink w:anchor="_Toc228464082" w:history="1">
         <w:r>
           <w:rPr>
             <w:rStyle w:val="Hyperlink"/>
             <w:rFonts w:ascii="Arial" w:hAnsi="Arial"/>
             <w:noProof/>
           </w:rPr>
-          <w:t>4. Unique ID Impact</w:t>
+          <w:t>2. Data Structure Decisions</w:t>
         </w:r>
         <w:r>
           <w:rPr>
@@ -716,84 +333,7 @@
             <w:noProof/>
             <w:webHidden/>
           </w:rPr>
-          <w:instrText xml:space="preserve"> PAGEREF _Toc228460202 \h </w:instrText>
-        </w:r>
-        <w:r>
-          <w:rPr>
-            <w:noProof/>
-            <w:webHidden/>
-          </w:rPr>
-        </w:r>
-        <w:r>
-          <w:rPr>
-            <w:noProof/>
-            <w:webHidden/>
-          </w:rPr>
-          <w:fldChar w:fldCharType="separate"/>
-        </w:r>
-        <w:r>
-          <w:rPr>
-            <w:noProof/>
-            <w:webHidden/>
-          </w:rPr>
-          <w:t>3</w:t>
-        </w:r>
-        <w:r>
-          <w:rPr>
-            <w:noProof/>
-            <w:webHidden/>
-          </w:rPr>
-          <w:fldChar w:fldCharType="end"/>
-        </w:r>
-      </w:hyperlink>
-    </w:p>
-    <w:p>
-      <w:pPr>
-        <w:pStyle w:val="TOC1"/>
-        <w:tabs>
-          <w:tab w:val="right" w:pos="14390"/>
-        </w:tabs>
-        <w:rPr>
-          <w:b w:val="0"/>
-          <w:bCs w:val="0"/>
-          <w:caps w:val="0"/>
-          <w:noProof/>
-          <w:kern w:val="2"/>
-          <w:sz w:val="24"/>
-          <w:szCs w:val="24"/>
-          <w:u w:val="none"/>
-          <w14:ligatures w14:val="standardContextual"/>
-        </w:rPr>
-      </w:pPr>
-      <w:hyperlink w:anchor="_Toc228460203" w:history="1">
-        <w:r>
-          <w:rPr>
-            <w:rStyle w:val="Hyperlink"/>
-            <w:rFonts w:ascii="Arial" w:hAnsi="Arial"/>
-            <w:noProof/>
-          </w:rPr>
-          <w:t>5. JUnit Test Case Tables</w:t>
-        </w:r>
-        <w:r>
-          <w:rPr>
-            <w:noProof/>
-            <w:webHidden/>
-          </w:rPr>
-          <w:tab/>
-        </w:r>
-        <w:r>
-          <w:rPr>
-            <w:noProof/>
-            <w:webHidden/>
-          </w:rPr>
-          <w:fldChar w:fldCharType="begin"/>
-        </w:r>
-        <w:r>
-          <w:rPr>
-            <w:noProof/>
-            <w:webHidden/>
-          </w:rPr>
-          <w:instrText xml:space="preserve"> PAGEREF _Toc228460203 \h </w:instrText>
+          <w:instrText xml:space="preserve"> PAGEREF _Toc228464082 \h </w:instrText>
         </w:r>
         <w:r>
           <w:rPr>
@@ -841,14 +381,14 @@
           <w14:ligatures w14:val="standardContextual"/>
         </w:rPr>
       </w:pPr>
-      <w:hyperlink w:anchor="_Toc228460204" w:history="1">
+      <w:hyperlink w:anchor="_Toc228464083" w:history="1">
         <w:r>
           <w:rPr>
             <w:rStyle w:val="Hyperlink"/>
             <w:rFonts w:ascii="Arial" w:hAnsi="Arial"/>
             <w:noProof/>
           </w:rPr>
-          <w:t>Hangar Class Tests</w:t>
+          <w:t>ArrayList&lt;Drone&gt;</w:t>
         </w:r>
         <w:r>
           <w:rPr>
@@ -869,7 +409,7 @@
             <w:noProof/>
             <w:webHidden/>
           </w:rPr>
-          <w:instrText xml:space="preserve"> PAGEREF _Toc228460204 \h </w:instrText>
+          <w:instrText xml:space="preserve"> PAGEREF _Toc228464083 \h </w:instrText>
         </w:r>
         <w:r>
           <w:rPr>
@@ -917,7 +457,542 @@
           <w14:ligatures w14:val="standardContextual"/>
         </w:rPr>
       </w:pPr>
-      <w:hyperlink w:anchor="_Toc228460205" w:history="1">
+      <w:hyperlink w:anchor="_Toc228464084" w:history="1">
+        <w:r>
+          <w:rPr>
+            <w:rStyle w:val="Hyperlink"/>
+            <w:rFonts w:ascii="Arial" w:hAnsi="Arial"/>
+            <w:noProof/>
+          </w:rPr>
+          <w:t>HashMap&lt;String, Drone&gt;</w:t>
+        </w:r>
+        <w:r>
+          <w:rPr>
+            <w:noProof/>
+            <w:webHidden/>
+          </w:rPr>
+          <w:tab/>
+        </w:r>
+        <w:r>
+          <w:rPr>
+            <w:noProof/>
+            <w:webHidden/>
+          </w:rPr>
+          <w:fldChar w:fldCharType="begin"/>
+        </w:r>
+        <w:r>
+          <w:rPr>
+            <w:noProof/>
+            <w:webHidden/>
+          </w:rPr>
+          <w:instrText xml:space="preserve"> PAGEREF _Toc228464084 \h </w:instrText>
+        </w:r>
+        <w:r>
+          <w:rPr>
+            <w:noProof/>
+            <w:webHidden/>
+          </w:rPr>
+        </w:r>
+        <w:r>
+          <w:rPr>
+            <w:noProof/>
+            <w:webHidden/>
+          </w:rPr>
+          <w:fldChar w:fldCharType="separate"/>
+        </w:r>
+        <w:r>
+          <w:rPr>
+            <w:noProof/>
+            <w:webHidden/>
+          </w:rPr>
+          <w:t>4</w:t>
+        </w:r>
+        <w:r>
+          <w:rPr>
+            <w:noProof/>
+            <w:webHidden/>
+          </w:rPr>
+          <w:fldChar w:fldCharType="end"/>
+        </w:r>
+      </w:hyperlink>
+    </w:p>
+    <w:p>
+      <w:pPr>
+        <w:pStyle w:val="TOC2"/>
+        <w:tabs>
+          <w:tab w:val="right" w:pos="14390"/>
+        </w:tabs>
+        <w:rPr>
+          <w:b w:val="0"/>
+          <w:bCs w:val="0"/>
+          <w:smallCaps w:val="0"/>
+          <w:noProof/>
+          <w:kern w:val="2"/>
+          <w:sz w:val="24"/>
+          <w:szCs w:val="24"/>
+          <w14:ligatures w14:val="standardContextual"/>
+        </w:rPr>
+      </w:pPr>
+      <w:hyperlink w:anchor="_Toc228464085" w:history="1">
+        <w:r>
+          <w:rPr>
+            <w:rStyle w:val="Hyperlink"/>
+            <w:rFonts w:ascii="Arial" w:hAnsi="Arial"/>
+            <w:noProof/>
+          </w:rPr>
+          <w:t>Queue&lt;Drone&gt; using LinkedList</w:t>
+        </w:r>
+        <w:r>
+          <w:rPr>
+            <w:noProof/>
+            <w:webHidden/>
+          </w:rPr>
+          <w:tab/>
+        </w:r>
+        <w:r>
+          <w:rPr>
+            <w:noProof/>
+            <w:webHidden/>
+          </w:rPr>
+          <w:fldChar w:fldCharType="begin"/>
+        </w:r>
+        <w:r>
+          <w:rPr>
+            <w:noProof/>
+            <w:webHidden/>
+          </w:rPr>
+          <w:instrText xml:space="preserve"> PAGEREF _Toc228464085 \h </w:instrText>
+        </w:r>
+        <w:r>
+          <w:rPr>
+            <w:noProof/>
+            <w:webHidden/>
+          </w:rPr>
+        </w:r>
+        <w:r>
+          <w:rPr>
+            <w:noProof/>
+            <w:webHidden/>
+          </w:rPr>
+          <w:fldChar w:fldCharType="separate"/>
+        </w:r>
+        <w:r>
+          <w:rPr>
+            <w:noProof/>
+            <w:webHidden/>
+          </w:rPr>
+          <w:t>4</w:t>
+        </w:r>
+        <w:r>
+          <w:rPr>
+            <w:noProof/>
+            <w:webHidden/>
+          </w:rPr>
+          <w:fldChar w:fldCharType="end"/>
+        </w:r>
+      </w:hyperlink>
+    </w:p>
+    <w:p>
+      <w:pPr>
+        <w:pStyle w:val="TOC1"/>
+        <w:tabs>
+          <w:tab w:val="right" w:pos="14390"/>
+        </w:tabs>
+        <w:rPr>
+          <w:b w:val="0"/>
+          <w:bCs w:val="0"/>
+          <w:caps w:val="0"/>
+          <w:noProof/>
+          <w:kern w:val="2"/>
+          <w:sz w:val="24"/>
+          <w:szCs w:val="24"/>
+          <w:u w:val="none"/>
+          <w14:ligatures w14:val="standardContextual"/>
+        </w:rPr>
+      </w:pPr>
+      <w:hyperlink w:anchor="_Toc228464086" w:history="1">
+        <w:r>
+          <w:rPr>
+            <w:rStyle w:val="Hyperlink"/>
+            <w:rFonts w:ascii="Arial" w:hAnsi="Arial"/>
+            <w:noProof/>
+          </w:rPr>
+          <w:t>3. Data Structure Comparison: ArrayList-Based Queue vs Queue Using LinkedList</w:t>
+        </w:r>
+        <w:r>
+          <w:rPr>
+            <w:noProof/>
+            <w:webHidden/>
+          </w:rPr>
+          <w:tab/>
+        </w:r>
+        <w:r>
+          <w:rPr>
+            <w:noProof/>
+            <w:webHidden/>
+          </w:rPr>
+          <w:fldChar w:fldCharType="begin"/>
+        </w:r>
+        <w:r>
+          <w:rPr>
+            <w:noProof/>
+            <w:webHidden/>
+          </w:rPr>
+          <w:instrText xml:space="preserve"> PAGEREF _Toc228464086 \h </w:instrText>
+        </w:r>
+        <w:r>
+          <w:rPr>
+            <w:noProof/>
+            <w:webHidden/>
+          </w:rPr>
+        </w:r>
+        <w:r>
+          <w:rPr>
+            <w:noProof/>
+            <w:webHidden/>
+          </w:rPr>
+          <w:fldChar w:fldCharType="separate"/>
+        </w:r>
+        <w:r>
+          <w:rPr>
+            <w:noProof/>
+            <w:webHidden/>
+          </w:rPr>
+          <w:t>4</w:t>
+        </w:r>
+        <w:r>
+          <w:rPr>
+            <w:noProof/>
+            <w:webHidden/>
+          </w:rPr>
+          <w:fldChar w:fldCharType="end"/>
+        </w:r>
+      </w:hyperlink>
+    </w:p>
+    <w:p>
+      <w:pPr>
+        <w:pStyle w:val="TOC2"/>
+        <w:tabs>
+          <w:tab w:val="right" w:pos="14390"/>
+        </w:tabs>
+        <w:rPr>
+          <w:b w:val="0"/>
+          <w:bCs w:val="0"/>
+          <w:smallCaps w:val="0"/>
+          <w:noProof/>
+          <w:kern w:val="2"/>
+          <w:sz w:val="24"/>
+          <w:szCs w:val="24"/>
+          <w14:ligatures w14:val="standardContextual"/>
+        </w:rPr>
+      </w:pPr>
+      <w:hyperlink w:anchor="_Toc228464087" w:history="1">
+        <w:r>
+          <w:rPr>
+            <w:rStyle w:val="Hyperlink"/>
+            <w:rFonts w:ascii="Arial" w:hAnsi="Arial"/>
+            <w:noProof/>
+          </w:rPr>
+          <w:t>Visual Representation</w:t>
+        </w:r>
+        <w:r>
+          <w:rPr>
+            <w:noProof/>
+            <w:webHidden/>
+          </w:rPr>
+          <w:tab/>
+        </w:r>
+        <w:r>
+          <w:rPr>
+            <w:noProof/>
+            <w:webHidden/>
+          </w:rPr>
+          <w:fldChar w:fldCharType="begin"/>
+        </w:r>
+        <w:r>
+          <w:rPr>
+            <w:noProof/>
+            <w:webHidden/>
+          </w:rPr>
+          <w:instrText xml:space="preserve"> PAGEREF _Toc228464087 \h </w:instrText>
+        </w:r>
+        <w:r>
+          <w:rPr>
+            <w:noProof/>
+            <w:webHidden/>
+          </w:rPr>
+        </w:r>
+        <w:r>
+          <w:rPr>
+            <w:noProof/>
+            <w:webHidden/>
+          </w:rPr>
+          <w:fldChar w:fldCharType="separate"/>
+        </w:r>
+        <w:r>
+          <w:rPr>
+            <w:noProof/>
+            <w:webHidden/>
+          </w:rPr>
+          <w:t>5</w:t>
+        </w:r>
+        <w:r>
+          <w:rPr>
+            <w:noProof/>
+            <w:webHidden/>
+          </w:rPr>
+          <w:fldChar w:fldCharType="end"/>
+        </w:r>
+      </w:hyperlink>
+    </w:p>
+    <w:p>
+      <w:pPr>
+        <w:pStyle w:val="TOC1"/>
+        <w:tabs>
+          <w:tab w:val="right" w:pos="14390"/>
+        </w:tabs>
+        <w:rPr>
+          <w:b w:val="0"/>
+          <w:bCs w:val="0"/>
+          <w:caps w:val="0"/>
+          <w:noProof/>
+          <w:kern w:val="2"/>
+          <w:sz w:val="24"/>
+          <w:szCs w:val="24"/>
+          <w:u w:val="none"/>
+          <w14:ligatures w14:val="standardContextual"/>
+        </w:rPr>
+      </w:pPr>
+      <w:hyperlink w:anchor="_Toc228464088" w:history="1">
+        <w:r>
+          <w:rPr>
+            <w:rStyle w:val="Hyperlink"/>
+            <w:rFonts w:ascii="Arial" w:hAnsi="Arial"/>
+            <w:noProof/>
+          </w:rPr>
+          <w:t>4. Unique ID Impact</w:t>
+        </w:r>
+        <w:r>
+          <w:rPr>
+            <w:noProof/>
+            <w:webHidden/>
+          </w:rPr>
+          <w:tab/>
+        </w:r>
+        <w:r>
+          <w:rPr>
+            <w:noProof/>
+            <w:webHidden/>
+          </w:rPr>
+          <w:fldChar w:fldCharType="begin"/>
+        </w:r>
+        <w:r>
+          <w:rPr>
+            <w:noProof/>
+            <w:webHidden/>
+          </w:rPr>
+          <w:instrText xml:space="preserve"> PAGEREF _Toc228464088 \h </w:instrText>
+        </w:r>
+        <w:r>
+          <w:rPr>
+            <w:noProof/>
+            <w:webHidden/>
+          </w:rPr>
+        </w:r>
+        <w:r>
+          <w:rPr>
+            <w:noProof/>
+            <w:webHidden/>
+          </w:rPr>
+          <w:fldChar w:fldCharType="separate"/>
+        </w:r>
+        <w:r>
+          <w:rPr>
+            <w:noProof/>
+            <w:webHidden/>
+          </w:rPr>
+          <w:t>5</w:t>
+        </w:r>
+        <w:r>
+          <w:rPr>
+            <w:noProof/>
+            <w:webHidden/>
+          </w:rPr>
+          <w:fldChar w:fldCharType="end"/>
+        </w:r>
+      </w:hyperlink>
+    </w:p>
+    <w:p>
+      <w:pPr>
+        <w:pStyle w:val="TOC1"/>
+        <w:tabs>
+          <w:tab w:val="right" w:pos="14390"/>
+        </w:tabs>
+        <w:rPr>
+          <w:b w:val="0"/>
+          <w:bCs w:val="0"/>
+          <w:caps w:val="0"/>
+          <w:noProof/>
+          <w:kern w:val="2"/>
+          <w:sz w:val="24"/>
+          <w:szCs w:val="24"/>
+          <w:u w:val="none"/>
+          <w14:ligatures w14:val="standardContextual"/>
+        </w:rPr>
+      </w:pPr>
+      <w:hyperlink w:anchor="_Toc228464089" w:history="1">
+        <w:r>
+          <w:rPr>
+            <w:rStyle w:val="Hyperlink"/>
+            <w:rFonts w:ascii="Arial" w:hAnsi="Arial"/>
+            <w:noProof/>
+          </w:rPr>
+          <w:t>5. JUnit Test Case Tables</w:t>
+        </w:r>
+        <w:r>
+          <w:rPr>
+            <w:noProof/>
+            <w:webHidden/>
+          </w:rPr>
+          <w:tab/>
+        </w:r>
+        <w:r>
+          <w:rPr>
+            <w:noProof/>
+            <w:webHidden/>
+          </w:rPr>
+          <w:fldChar w:fldCharType="begin"/>
+        </w:r>
+        <w:r>
+          <w:rPr>
+            <w:noProof/>
+            <w:webHidden/>
+          </w:rPr>
+          <w:instrText xml:space="preserve"> PAGEREF _Toc228464089 \h </w:instrText>
+        </w:r>
+        <w:r>
+          <w:rPr>
+            <w:noProof/>
+            <w:webHidden/>
+          </w:rPr>
+        </w:r>
+        <w:r>
+          <w:rPr>
+            <w:noProof/>
+            <w:webHidden/>
+          </w:rPr>
+          <w:fldChar w:fldCharType="separate"/>
+        </w:r>
+        <w:r>
+          <w:rPr>
+            <w:noProof/>
+            <w:webHidden/>
+          </w:rPr>
+          <w:t>6</w:t>
+        </w:r>
+        <w:r>
+          <w:rPr>
+            <w:noProof/>
+            <w:webHidden/>
+          </w:rPr>
+          <w:fldChar w:fldCharType="end"/>
+        </w:r>
+      </w:hyperlink>
+    </w:p>
+    <w:p>
+      <w:pPr>
+        <w:pStyle w:val="TOC2"/>
+        <w:tabs>
+          <w:tab w:val="right" w:pos="14390"/>
+        </w:tabs>
+        <w:rPr>
+          <w:b w:val="0"/>
+          <w:bCs w:val="0"/>
+          <w:smallCaps w:val="0"/>
+          <w:noProof/>
+          <w:kern w:val="2"/>
+          <w:sz w:val="24"/>
+          <w:szCs w:val="24"/>
+          <w14:ligatures w14:val="standardContextual"/>
+        </w:rPr>
+      </w:pPr>
+      <w:hyperlink w:anchor="_Toc228464090" w:history="1">
+        <w:r>
+          <w:rPr>
+            <w:rStyle w:val="Hyperlink"/>
+            <w:rFonts w:ascii="Arial" w:hAnsi="Arial"/>
+            <w:noProof/>
+          </w:rPr>
+          <w:t>Hangar Class Tests</w:t>
+        </w:r>
+        <w:r>
+          <w:rPr>
+            <w:noProof/>
+            <w:webHidden/>
+          </w:rPr>
+          <w:tab/>
+        </w:r>
+        <w:r>
+          <w:rPr>
+            <w:noProof/>
+            <w:webHidden/>
+          </w:rPr>
+          <w:fldChar w:fldCharType="begin"/>
+        </w:r>
+        <w:r>
+          <w:rPr>
+            <w:noProof/>
+            <w:webHidden/>
+          </w:rPr>
+          <w:instrText xml:space="preserve"> PAGEREF _Toc228464090 \h </w:instrText>
+        </w:r>
+        <w:r>
+          <w:rPr>
+            <w:noProof/>
+            <w:webHidden/>
+          </w:rPr>
+        </w:r>
+        <w:r>
+          <w:rPr>
+            <w:noProof/>
+            <w:webHidden/>
+          </w:rPr>
+          <w:fldChar w:fldCharType="separate"/>
+        </w:r>
+        <w:r>
+          <w:rPr>
+            <w:noProof/>
+            <w:webHidden/>
+          </w:rPr>
+          <w:t>6</w:t>
+        </w:r>
+        <w:r>
+          <w:rPr>
+            <w:noProof/>
+            <w:webHidden/>
+          </w:rPr>
+          <w:fldChar w:fldCharType="end"/>
+        </w:r>
+      </w:hyperlink>
+    </w:p>
+    <w:p>
+      <w:pPr>
+        <w:pStyle w:val="TOC2"/>
+        <w:tabs>
+          <w:tab w:val="right" w:pos="14390"/>
+        </w:tabs>
+        <w:rPr>
+          <w:b w:val="0"/>
+          <w:bCs w:val="0"/>
+          <w:smallCaps w:val="0"/>
+          <w:noProof/>
+          <w:kern w:val="2"/>
+          <w:sz w:val="24"/>
+          <w:szCs w:val="24"/>
+          <w14:ligatures w14:val="standardContextual"/>
+        </w:rPr>
+      </w:pPr>
+      <w:hyperlink w:anchor="_Toc228464091" w:history="1">
         <w:r>
           <w:rPr>
             <w:rStyle w:val="Hyperlink"/>
@@ -945,7 +1020,7 @@
             <w:noProof/>
             <w:webHidden/>
           </w:rPr>
-          <w:instrText xml:space="preserve"> PAGEREF _Toc228460205 \h </w:instrText>
+          <w:instrText xml:space="preserve"> PAGEREF _Toc228464091 \h </w:instrText>
         </w:r>
         <w:r>
           <w:rPr>
@@ -965,7 +1040,7 @@
             <w:noProof/>
             <w:webHidden/>
           </w:rPr>
-          <w:t>7</w:t>
+          <w:t>9</w:t>
         </w:r>
         <w:r>
           <w:rPr>
@@ -993,7 +1068,7 @@
           <w14:ligatures w14:val="standardContextual"/>
         </w:rPr>
       </w:pPr>
-      <w:hyperlink w:anchor="_Toc228460206" w:history="1">
+      <w:hyperlink w:anchor="_Toc228464092" w:history="1">
         <w:r>
           <w:rPr>
             <w:rStyle w:val="Hyperlink"/>
@@ -1021,7 +1096,7 @@
             <w:noProof/>
             <w:webHidden/>
           </w:rPr>
-          <w:instrText xml:space="preserve"> PAGEREF _Toc228460206 \h </w:instrText>
+          <w:instrText xml:space="preserve"> PAGEREF _Toc228464092 \h </w:instrText>
         </w:r>
         <w:r>
           <w:rPr>
@@ -1041,7 +1116,7 @@
             <w:noProof/>
             <w:webHidden/>
           </w:rPr>
-          <w:t>8</w:t>
+          <w:t>10</w:t>
         </w:r>
         <w:r>
           <w:rPr>
@@ -1069,7 +1144,7 @@
           <w14:ligatures w14:val="standardContextual"/>
         </w:rPr>
       </w:pPr>
-      <w:hyperlink w:anchor="_Toc228460207" w:history="1">
+      <w:hyperlink w:anchor="_Toc228464093" w:history="1">
         <w:r>
           <w:rPr>
             <w:rStyle w:val="Hyperlink"/>
@@ -1097,7 +1172,7 @@
             <w:noProof/>
             <w:webHidden/>
           </w:rPr>
-          <w:instrText xml:space="preserve"> PAGEREF _Toc228460207 \h </w:instrText>
+          <w:instrText xml:space="preserve"> PAGEREF _Toc228464093 \h </w:instrText>
         </w:r>
         <w:r>
           <w:rPr>
@@ -1117,7 +1192,7 @@
             <w:noProof/>
             <w:webHidden/>
           </w:rPr>
-          <w:t>8</w:t>
+          <w:t>10</w:t>
         </w:r>
         <w:r>
           <w:rPr>
@@ -1147,7 +1222,7 @@
         </w:rPr>
       </w:pPr>
       <w:bookmarkStart w:id="0" w:name="_Toc228460068"/>
-      <w:bookmarkStart w:id="1" w:name="_Toc228460194"/>
+      <w:bookmarkStart w:id="1" w:name="_Toc228464079"/>
       <w:r>
         <w:rPr>
           <w:rFonts w:ascii="Arial" w:hAnsi="Arial"/>
@@ -1180,13 +1255,73 @@
     <w:p>
       <w:pPr>
         <w:pStyle w:val="Heading2"/>
+      </w:pPr>
+      <w:bookmarkStart w:id="2" w:name="_Toc228464081"/>
+      <w:r>
+        <w:t>UML Design</w:t>
+      </w:r>
+      <w:bookmarkEnd w:id="2"/>
+    </w:p>
+    <w:p>
+      <w:r>
+        <w:drawing>
+          <wp:inline distT="0" distB="0" distL="0" distR="0" wp14:anchorId="24D2282A" wp14:editId="34CA2C7B">
+            <wp:extent cx="8492247" cy="5661498"/>
+            <wp:effectExtent l="0" t="0" r="4445" b="3175"/>
+            <wp:docPr id="781909901" name="Picture 1" descr="A screenshot of a computer&#10;&#10;AI-generated content may be incorrect."/>
+            <wp:cNvGraphicFramePr>
+              <a:graphicFrameLocks xmlns:a="http://schemas.openxmlformats.org/drawingml/2006/main" noChangeAspect="1"/>
+            </wp:cNvGraphicFramePr>
+            <a:graphic xmlns:a="http://schemas.openxmlformats.org/drawingml/2006/main">
+              <a:graphicData uri="http://schemas.openxmlformats.org/drawingml/2006/picture">
+                <pic:pic xmlns:pic="http://schemas.openxmlformats.org/drawingml/2006/picture">
+                  <pic:nvPicPr>
+                    <pic:cNvPr id="781909901" name="Picture 1" descr="A screenshot of a computer&#10;&#10;AI-generated content may be incorrect."/>
+                    <pic:cNvPicPr/>
+                  </pic:nvPicPr>
+                  <pic:blipFill>
+                    <a:blip r:embed="rId6"/>
+                    <a:stretch>
+                      <a:fillRect/>
+                    </a:stretch>
+                  </pic:blipFill>
+                  <pic:spPr>
+                    <a:xfrm>
+                      <a:off x="0" y="0"/>
+                      <a:ext cx="8516956" cy="5677970"/>
+                    </a:xfrm>
+                    <a:prstGeom prst="rect">
+                      <a:avLst/>
+                    </a:prstGeom>
+                  </pic:spPr>
+                </pic:pic>
+              </a:graphicData>
+            </a:graphic>
+          </wp:inline>
+        </w:drawing>
+      </w:r>
+    </w:p>
+    <w:p>
+      <w:pPr>
+        <w:pStyle w:val="Heading2"/>
+        <w:rPr>
+          <w:rFonts w:ascii="Arial" w:hAnsi="Arial"/>
+          <w:color w:val="2F75B5"/>
+          <w:sz w:val="24"/>
+          <w:szCs w:val="24"/>
+        </w:rPr>
+      </w:pPr>
+      <w:bookmarkStart w:id="3" w:name="_Toc228460069"/>
+      <w:bookmarkStart w:id="4" w:name="_Toc228464080"/>
+    </w:p>
+    <w:p>
+      <w:pPr>
+        <w:pStyle w:val="Heading2"/>
         <w:rPr>
           <w:sz w:val="24"/>
           <w:szCs w:val="24"/>
         </w:rPr>
       </w:pPr>
-      <w:bookmarkStart w:id="2" w:name="_Toc228460069"/>
-      <w:bookmarkStart w:id="3" w:name="_Toc228460195"/>
       <w:r>
         <w:rPr>
           <w:rFonts w:ascii="Arial" w:hAnsi="Arial"/>
@@ -1196,8 +1331,8 @@
         </w:rPr>
         <w:t>Key Features</w:t>
       </w:r>
-      <w:bookmarkEnd w:id="2"/>
       <w:bookmarkEnd w:id="3"/>
+      <w:bookmarkEnd w:id="4"/>
     </w:p>
     <w:p>
       <w:pPr>
@@ -1334,8 +1469,8 @@
           <w:szCs w:val="24"/>
         </w:rPr>
       </w:pPr>
-      <w:bookmarkStart w:id="4" w:name="_Toc228460070"/>
-      <w:bookmarkStart w:id="5" w:name="_Toc228460196"/>
+      <w:bookmarkStart w:id="5" w:name="_Toc228460070"/>
+      <w:bookmarkStart w:id="6" w:name="_Toc228464082"/>
       <w:r>
         <w:rPr>
           <w:rFonts w:ascii="Arial" w:hAnsi="Arial"/>
@@ -1345,8 +1480,8 @@
         </w:rPr>
         <w:t>2. Data Structure Decisions</w:t>
       </w:r>
-      <w:bookmarkEnd w:id="4"/>
       <w:bookmarkEnd w:id="5"/>
+      <w:bookmarkEnd w:id="6"/>
     </w:p>
     <w:p>
       <w:pPr>
@@ -1356,8 +1491,8 @@
           <w:szCs w:val="24"/>
         </w:rPr>
       </w:pPr>
-      <w:bookmarkStart w:id="6" w:name="_Toc228460071"/>
-      <w:bookmarkStart w:id="7" w:name="_Toc228460197"/>
+      <w:bookmarkStart w:id="7" w:name="_Toc228460071"/>
+      <w:bookmarkStart w:id="8" w:name="_Toc228464083"/>
       <w:r>
         <w:rPr>
           <w:rFonts w:ascii="Arial" w:hAnsi="Arial"/>
@@ -1367,8 +1502,8 @@
         </w:rPr>
         <w:t>ArrayList&lt;Drone&gt;</w:t>
       </w:r>
-      <w:bookmarkEnd w:id="6"/>
       <w:bookmarkEnd w:id="7"/>
+      <w:bookmarkEnd w:id="8"/>
     </w:p>
     <w:p>
       <w:pPr>
@@ -1394,8 +1529,8 @@
           <w:szCs w:val="24"/>
         </w:rPr>
       </w:pPr>
-      <w:bookmarkStart w:id="8" w:name="_Toc228460072"/>
-      <w:bookmarkStart w:id="9" w:name="_Toc228460198"/>
+      <w:bookmarkStart w:id="9" w:name="_Toc228460072"/>
+      <w:bookmarkStart w:id="10" w:name="_Toc228464084"/>
       <w:r>
         <w:rPr>
           <w:rFonts w:ascii="Arial" w:hAnsi="Arial"/>
@@ -1405,8 +1540,8 @@
         </w:rPr>
         <w:t>HashMap&lt;String, Drone&gt;</w:t>
       </w:r>
-      <w:bookmarkEnd w:id="8"/>
       <w:bookmarkEnd w:id="9"/>
+      <w:bookmarkEnd w:id="10"/>
     </w:p>
     <w:p>
       <w:pPr>
@@ -1432,8 +1567,8 @@
           <w:szCs w:val="24"/>
         </w:rPr>
       </w:pPr>
-      <w:bookmarkStart w:id="10" w:name="_Toc228460073"/>
-      <w:bookmarkStart w:id="11" w:name="_Toc228460199"/>
+      <w:bookmarkStart w:id="11" w:name="_Toc228460073"/>
+      <w:bookmarkStart w:id="12" w:name="_Toc228464085"/>
       <w:r>
         <w:rPr>
           <w:rFonts w:ascii="Arial" w:hAnsi="Arial"/>
@@ -1443,8 +1578,8 @@
         </w:rPr>
         <w:t>Queue&lt;Drone&gt; using LinkedList</w:t>
       </w:r>
-      <w:bookmarkEnd w:id="10"/>
       <w:bookmarkEnd w:id="11"/>
+      <w:bookmarkEnd w:id="12"/>
     </w:p>
     <w:p>
       <w:pPr>
@@ -1470,8 +1605,8 @@
           <w:szCs w:val="24"/>
         </w:rPr>
       </w:pPr>
-      <w:bookmarkStart w:id="12" w:name="_Toc228460074"/>
-      <w:bookmarkStart w:id="13" w:name="_Toc228460200"/>
+      <w:bookmarkStart w:id="13" w:name="_Toc228460074"/>
+      <w:bookmarkStart w:id="14" w:name="_Toc228464086"/>
       <w:r>
         <w:rPr>
           <w:rFonts w:ascii="Arial" w:hAnsi="Arial"/>
@@ -1481,8 +1616,8 @@
         </w:rPr>
         <w:t>3. Data Structure Comparison: ArrayList-Based Queue vs Queue Using LinkedList</w:t>
       </w:r>
-      <w:bookmarkEnd w:id="12"/>
       <w:bookmarkEnd w:id="13"/>
+      <w:bookmarkEnd w:id="14"/>
     </w:p>
     <w:p>
       <w:pPr>
@@ -1866,8 +2001,8 @@
           <w:szCs w:val="24"/>
         </w:rPr>
       </w:pPr>
-      <w:bookmarkStart w:id="14" w:name="_Toc228460075"/>
-      <w:bookmarkStart w:id="15" w:name="_Toc228460201"/>
+      <w:bookmarkStart w:id="15" w:name="_Toc228460075"/>
+      <w:bookmarkStart w:id="16" w:name="_Toc228464087"/>
       <w:r>
         <w:rPr>
           <w:rFonts w:ascii="Arial" w:hAnsi="Arial"/>
@@ -1878,8 +2013,8 @@
         <w:lastRenderedPageBreak/>
         <w:t>Visual Representation</w:t>
       </w:r>
-      <w:bookmarkEnd w:id="14"/>
       <w:bookmarkEnd w:id="15"/>
+      <w:bookmarkEnd w:id="16"/>
     </w:p>
     <w:p>
       <w:pPr>
@@ -1910,7 +2045,7 @@
                     <pic:cNvPicPr/>
                   </pic:nvPicPr>
                   <pic:blipFill>
-                    <a:blip r:embed="rId6"/>
+                    <a:blip r:embed="rId7"/>
                     <a:stretch>
                       <a:fillRect/>
                     </a:stretch>
@@ -1939,8 +2074,8 @@
           <w:szCs w:val="24"/>
         </w:rPr>
       </w:pPr>
-      <w:bookmarkStart w:id="16" w:name="_Toc228460076"/>
-      <w:bookmarkStart w:id="17" w:name="_Toc228460202"/>
+      <w:bookmarkStart w:id="17" w:name="_Toc228460076"/>
+      <w:bookmarkStart w:id="18" w:name="_Toc228464088"/>
       <w:r>
         <w:rPr>
           <w:rFonts w:ascii="Arial" w:hAnsi="Arial"/>
@@ -1950,8 +2085,8 @@
         </w:rPr>
         <w:t>4. Unique ID Impact</w:t>
       </w:r>
-      <w:bookmarkEnd w:id="16"/>
       <w:bookmarkEnd w:id="17"/>
+      <w:bookmarkEnd w:id="18"/>
     </w:p>
     <w:p>
       <w:pPr>
@@ -1977,8 +2112,8 @@
           <w:szCs w:val="24"/>
         </w:rPr>
       </w:pPr>
-      <w:bookmarkStart w:id="18" w:name="_Toc228460077"/>
-      <w:bookmarkStart w:id="19" w:name="_Toc228460203"/>
+      <w:bookmarkStart w:id="19" w:name="_Toc228460077"/>
+      <w:bookmarkStart w:id="20" w:name="_Toc228464089"/>
       <w:r>
         <w:rPr>
           <w:rFonts w:ascii="Arial" w:hAnsi="Arial"/>
@@ -1989,8 +2124,8 @@
         <w:lastRenderedPageBreak/>
         <w:t>5. JUnit Test Case Tables</w:t>
       </w:r>
-      <w:bookmarkEnd w:id="18"/>
       <w:bookmarkEnd w:id="19"/>
+      <w:bookmarkEnd w:id="20"/>
     </w:p>
     <w:p>
       <w:pPr>
@@ -2012,8 +2147,8 @@
       <w:pPr>
         <w:pStyle w:val="Heading2"/>
       </w:pPr>
-      <w:bookmarkStart w:id="20" w:name="_Toc228460078"/>
-      <w:bookmarkStart w:id="21" w:name="_Toc228460204"/>
+      <w:bookmarkStart w:id="21" w:name="_Toc228460078"/>
+      <w:bookmarkStart w:id="22" w:name="_Toc228464090"/>
       <w:r>
         <w:rPr>
           <w:rFonts w:ascii="Arial" w:hAnsi="Arial"/>
@@ -2021,14 +2156,14 @@
         </w:rPr>
         <w:t>Hangar Class Tests</w:t>
       </w:r>
-      <w:bookmarkEnd w:id="20"/>
       <w:bookmarkEnd w:id="21"/>
+      <w:bookmarkEnd w:id="22"/>
     </w:p>
     <w:p>
       <w:pPr>
         <w:pStyle w:val="Heading3"/>
       </w:pPr>
-      <w:bookmarkStart w:id="22" w:name="_Toc228460079"/>
+      <w:bookmarkStart w:id="23" w:name="_Toc228460079"/>
       <w:r>
         <w:rPr>
           <w:rFonts w:ascii="Arial" w:hAnsi="Arial"/>
@@ -2036,7 +2171,7 @@
         </w:rPr>
         <w:t>Constructor / starting state</w:t>
       </w:r>
-      <w:bookmarkEnd w:id="22"/>
+      <w:bookmarkEnd w:id="23"/>
     </w:p>
     <w:p>
       <w:pPr>
@@ -2316,7 +2451,7 @@
       <w:pPr>
         <w:pStyle w:val="Heading3"/>
       </w:pPr>
-      <w:bookmarkStart w:id="23" w:name="_Toc228460080"/>
+      <w:bookmarkStart w:id="24" w:name="_Toc228460080"/>
       <w:proofErr w:type="gramStart"/>
       <w:r>
         <w:t>addDrone(</w:t>
@@ -2325,7 +2460,7 @@
       <w:r>
         <w:t>Drone drone)</w:t>
       </w:r>
-      <w:bookmarkEnd w:id="23"/>
+      <w:bookmarkEnd w:id="24"/>
     </w:p>
     <w:p>
       <w:pPr>
@@ -2605,7 +2740,7 @@
       <w:pPr>
         <w:pStyle w:val="Heading3"/>
       </w:pPr>
-      <w:bookmarkStart w:id="24" w:name="_Toc228460081"/>
+      <w:bookmarkStart w:id="25" w:name="_Toc228460081"/>
       <w:r>
         <w:rPr>
           <w:rFonts w:ascii="Arial" w:hAnsi="Arial"/>
@@ -2613,7 +2748,7 @@
         </w:rPr>
         <w:t>getAllDrones()</w:t>
       </w:r>
-      <w:bookmarkEnd w:id="24"/>
+      <w:bookmarkEnd w:id="25"/>
     </w:p>
     <w:p>
       <w:pPr>
@@ -2974,7 +3109,7 @@
       <w:pPr>
         <w:pStyle w:val="Heading3"/>
       </w:pPr>
-      <w:bookmarkStart w:id="25" w:name="_Toc228460082"/>
+      <w:bookmarkStart w:id="26" w:name="_Toc228460082"/>
       <w:r>
         <w:rPr>
           <w:rFonts w:ascii="Arial" w:hAnsi="Arial"/>
@@ -2982,7 +3117,7 @@
         </w:rPr>
         <w:t>findDroneById(String droneId)</w:t>
       </w:r>
-      <w:bookmarkEnd w:id="25"/>
+      <w:bookmarkEnd w:id="26"/>
     </w:p>
     <w:p>
       <w:pPr>
@@ -3338,20 +3473,70 @@
         </w:tc>
       </w:tr>
     </w:tbl>
-    <w:p/>
     <w:p>
       <w:pPr>
         <w:pStyle w:val="Heading3"/>
       </w:pPr>
-      <w:bookmarkStart w:id="26" w:name="_Toc228460083"/>
+      <w:bookmarkStart w:id="27" w:name="_Toc228460083"/>
+      <w:proofErr w:type="spellStart"/>
+      <w:proofErr w:type="gramStart"/>
       <w:r>
         <w:rPr>
           <w:rFonts w:ascii="Arial" w:hAnsi="Arial"/>
           <w:color w:val="2F75B5"/>
         </w:rPr>
-        <w:t>searchDronesByManufacturerAndType(String droneType, String manufacturerName)</w:t>
+        <w:lastRenderedPageBreak/>
+        <w:t>searchDronesByManufacturerAndType</w:t>
       </w:r>
-      <w:bookmarkEnd w:id="26"/>
+      <w:proofErr w:type="spellEnd"/>
+      <w:r>
+        <w:rPr>
+          <w:rFonts w:ascii="Arial" w:hAnsi="Arial"/>
+          <w:color w:val="2F75B5"/>
+        </w:rPr>
+        <w:t>(</w:t>
+      </w:r>
+      <w:proofErr w:type="gramEnd"/>
+      <w:r>
+        <w:rPr>
+          <w:rFonts w:ascii="Arial" w:hAnsi="Arial"/>
+          <w:color w:val="2F75B5"/>
+        </w:rPr>
+        <w:t xml:space="preserve">String </w:t>
+      </w:r>
+      <w:proofErr w:type="spellStart"/>
+      <w:r>
+        <w:rPr>
+          <w:rFonts w:ascii="Arial" w:hAnsi="Arial"/>
+          <w:color w:val="2F75B5"/>
+        </w:rPr>
+        <w:t>droneType</w:t>
+      </w:r>
+      <w:proofErr w:type="spellEnd"/>
+      <w:r>
+        <w:rPr>
+          <w:rFonts w:ascii="Arial" w:hAnsi="Arial"/>
+          <w:color w:val="2F75B5"/>
+        </w:rPr>
+        <w:t xml:space="preserve">, String </w:t>
+      </w:r>
+      <w:proofErr w:type="spellStart"/>
+      <w:r>
+        <w:rPr>
+          <w:rFonts w:ascii="Arial" w:hAnsi="Arial"/>
+          <w:color w:val="2F75B5"/>
+        </w:rPr>
+        <w:t>manufacturerName</w:t>
+      </w:r>
+      <w:proofErr w:type="spellEnd"/>
+      <w:r>
+        <w:rPr>
+          <w:rFonts w:ascii="Arial" w:hAnsi="Arial"/>
+          <w:color w:val="2F75B5"/>
+        </w:rPr>
+        <w:t>)</w:t>
+      </w:r>
+      <w:bookmarkEnd w:id="27"/>
     </w:p>
     <w:p>
       <w:pPr>
@@ -4112,20 +4297,46 @@
         </w:tc>
       </w:tr>
     </w:tbl>
-    <w:p/>
+    <w:p>
+      <w:pPr>
+        <w:pStyle w:val="Heading3"/>
+        <w:rPr>
+          <w:rFonts w:ascii="Arial" w:hAnsi="Arial"/>
+          <w:color w:val="2F75B5"/>
+        </w:rPr>
+      </w:pPr>
+      <w:bookmarkStart w:id="28" w:name="_Toc228460084"/>
+    </w:p>
     <w:p>
       <w:pPr>
         <w:pStyle w:val="Heading3"/>
       </w:pPr>
-      <w:bookmarkStart w:id="27" w:name="_Toc228460084"/>
+      <w:proofErr w:type="spellStart"/>
+      <w:proofErr w:type="gramStart"/>
       <w:r>
         <w:rPr>
           <w:rFonts w:ascii="Arial" w:hAnsi="Arial"/>
           <w:color w:val="2F75B5"/>
         </w:rPr>
-        <w:t>getDronesSortedByPayloadCapacity()</w:t>
+        <w:t>getDronesSortedByPayloadCapacity</w:t>
       </w:r>
-      <w:bookmarkEnd w:id="27"/>
+      <w:proofErr w:type="spellEnd"/>
+      <w:r>
+        <w:rPr>
+          <w:rFonts w:ascii="Arial" w:hAnsi="Arial"/>
+          <w:color w:val="2F75B5"/>
+        </w:rPr>
+        <w:t>(</w:t>
+      </w:r>
+      <w:proofErr w:type="gramEnd"/>
+      <w:r>
+        <w:rPr>
+          <w:rFonts w:ascii="Arial" w:hAnsi="Arial"/>
+          <w:color w:val="2F75B5"/>
+        </w:rPr>
+        <w:t>)</w:t>
+      </w:r>
+      <w:bookmarkEnd w:id="28"/>
     </w:p>
     <w:p>
       <w:pPr>
@@ -4562,7 +4773,6 @@
         </w:tc>
       </w:tr>
     </w:tbl>
-    <w:p/>
     <w:p>
       <w:pPr>
         <w:pStyle w:val="Heading3"/>
@@ -4571,7 +4781,16 @@
           <w:color w:val="2F75B5"/>
         </w:rPr>
       </w:pPr>
-      <w:bookmarkStart w:id="28" w:name="_Toc228460085"/>
+      <w:bookmarkStart w:id="29" w:name="_Toc228460085"/>
+    </w:p>
+    <w:p>
+      <w:pPr>
+        <w:pStyle w:val="Heading3"/>
+        <w:rPr>
+          <w:rFonts w:ascii="Arial" w:hAnsi="Arial"/>
+          <w:color w:val="2F75B5"/>
+        </w:rPr>
+      </w:pPr>
     </w:p>
     <w:p>
       <w:pPr>
@@ -4622,7 +4841,7 @@
         </w:rPr>
         <w:t>)</w:t>
       </w:r>
-      <w:bookmarkEnd w:id="28"/>
+      <w:bookmarkEnd w:id="29"/>
     </w:p>
     <w:p>
       <w:pPr>
@@ -5059,20 +5278,53 @@
         </w:tc>
       </w:tr>
     </w:tbl>
-    <w:p/>
     <w:p>
       <w:pPr>
         <w:pStyle w:val="Heading3"/>
       </w:pPr>
-      <w:bookmarkStart w:id="29" w:name="_Toc228460086"/>
+      <w:bookmarkStart w:id="30" w:name="_Toc228460086"/>
+      <w:proofErr w:type="spellStart"/>
+      <w:proofErr w:type="gramStart"/>
       <w:r>
         <w:rPr>
           <w:rFonts w:ascii="Arial" w:hAnsi="Arial"/>
           <w:color w:val="2F75B5"/>
         </w:rPr>
-        <w:t>getCountByManufacturer(String manufacturerName)</w:t>
+        <w:t>getCountByManufacturer</w:t>
       </w:r>
-      <w:bookmarkEnd w:id="29"/>
+      <w:proofErr w:type="spellEnd"/>
+      <w:r>
+        <w:rPr>
+          <w:rFonts w:ascii="Arial" w:hAnsi="Arial"/>
+          <w:color w:val="2F75B5"/>
+        </w:rPr>
+        <w:t>(</w:t>
+      </w:r>
+      <w:proofErr w:type="gramEnd"/>
+      <w:r>
+        <w:rPr>
+          <w:rFonts w:ascii="Arial" w:hAnsi="Arial"/>
+          <w:color w:val="2F75B5"/>
+        </w:rPr>
+        <w:t xml:space="preserve">String </w:t>
+      </w:r>
+      <w:proofErr w:type="spellStart"/>
+      <w:r>
+        <w:rPr>
+          <w:rFonts w:ascii="Arial" w:hAnsi="Arial"/>
+          <w:color w:val="2F75B5"/>
+        </w:rPr>
+        <w:t>manufacturerName</w:t>
+      </w:r>
+      <w:proofErr w:type="spellEnd"/>
+      <w:r>
+        <w:rPr>
+          <w:rFonts w:ascii="Arial" w:hAnsi="Arial"/>
+          <w:color w:val="2F75B5"/>
+        </w:rPr>
+        <w:t>)</w:t>
+      </w:r>
+      <w:bookmarkEnd w:id="30"/>
     </w:p>
     <w:p>
       <w:pPr>
@@ -5509,20 +5761,53 @@
         </w:tc>
       </w:tr>
     </w:tbl>
-    <w:p/>
     <w:p>
       <w:pPr>
         <w:pStyle w:val="Heading3"/>
       </w:pPr>
-      <w:bookmarkStart w:id="30" w:name="_Toc228460087"/>
+      <w:bookmarkStart w:id="31" w:name="_Toc228460087"/>
+      <w:proofErr w:type="spellStart"/>
+      <w:proofErr w:type="gramStart"/>
       <w:r>
         <w:rPr>
           <w:rFonts w:ascii="Arial" w:hAnsi="Arial"/>
           <w:color w:val="2F75B5"/>
         </w:rPr>
-        <w:t>addDroneToMaintenanceQueue(String droneId)</w:t>
+        <w:t>addDroneToMaintenanceQueue</w:t>
       </w:r>
-      <w:bookmarkEnd w:id="30"/>
+      <w:proofErr w:type="spellEnd"/>
+      <w:r>
+        <w:rPr>
+          <w:rFonts w:ascii="Arial" w:hAnsi="Arial"/>
+          <w:color w:val="2F75B5"/>
+        </w:rPr>
+        <w:t>(</w:t>
+      </w:r>
+      <w:proofErr w:type="gramEnd"/>
+      <w:r>
+        <w:rPr>
+          <w:rFonts w:ascii="Arial" w:hAnsi="Arial"/>
+          <w:color w:val="2F75B5"/>
+        </w:rPr>
+        <w:t xml:space="preserve">String </w:t>
+      </w:r>
+      <w:proofErr w:type="spellStart"/>
+      <w:r>
+        <w:rPr>
+          <w:rFonts w:ascii="Arial" w:hAnsi="Arial"/>
+          <w:color w:val="2F75B5"/>
+        </w:rPr>
+        <w:t>droneId</w:t>
+      </w:r>
+      <w:proofErr w:type="spellEnd"/>
+      <w:r>
+        <w:rPr>
+          <w:rFonts w:ascii="Arial" w:hAnsi="Arial"/>
+          <w:color w:val="2F75B5"/>
+        </w:rPr>
+        <w:t>)</w:t>
+      </w:r>
+      <w:bookmarkEnd w:id="31"/>
     </w:p>
     <w:p>
       <w:pPr>
@@ -5878,20 +6163,37 @@
         </w:tc>
       </w:tr>
     </w:tbl>
-    <w:p/>
     <w:p>
       <w:pPr>
         <w:pStyle w:val="Heading3"/>
       </w:pPr>
-      <w:bookmarkStart w:id="31" w:name="_Toc228460088"/>
+      <w:bookmarkStart w:id="32" w:name="_Toc228460088"/>
+      <w:proofErr w:type="spellStart"/>
+      <w:proofErr w:type="gramStart"/>
       <w:r>
         <w:rPr>
           <w:rFonts w:ascii="Arial" w:hAnsi="Arial"/>
           <w:color w:val="2F75B5"/>
         </w:rPr>
-        <w:t>processNextMaintenanceDrone()</w:t>
+        <w:t>processNextMaintenanceDrone</w:t>
       </w:r>
-      <w:bookmarkEnd w:id="31"/>
+      <w:proofErr w:type="spellEnd"/>
+      <w:r>
+        <w:rPr>
+          <w:rFonts w:ascii="Arial" w:hAnsi="Arial"/>
+          <w:color w:val="2F75B5"/>
+        </w:rPr>
+        <w:t>(</w:t>
+      </w:r>
+      <w:proofErr w:type="gramEnd"/>
+      <w:r>
+        <w:rPr>
+          <w:rFonts w:ascii="Arial" w:hAnsi="Arial"/>
+          <w:color w:val="2F75B5"/>
+        </w:rPr>
+        <w:t>)</w:t>
+      </w:r>
+      <w:bookmarkEnd w:id="32"/>
     </w:p>
     <w:p>
       <w:pPr>
@@ -6247,21 +6549,48 @@
         </w:tc>
       </w:tr>
     </w:tbl>
+    <w:p>
+      <w:pPr>
+        <w:pStyle w:val="Heading3"/>
+        <w:rPr>
+          <w:rFonts w:ascii="Arial" w:hAnsi="Arial"/>
+          <w:color w:val="2F75B5"/>
+        </w:rPr>
+      </w:pPr>
+      <w:bookmarkStart w:id="33" w:name="_Toc228460089"/>
+    </w:p>
     <w:p/>
     <w:p>
       <w:pPr>
         <w:pStyle w:val="Heading3"/>
       </w:pPr>
-      <w:bookmarkStart w:id="32" w:name="_Toc228460089"/>
+      <w:proofErr w:type="spellStart"/>
+      <w:proofErr w:type="gramStart"/>
       <w:r>
         <w:rPr>
           <w:rFonts w:ascii="Arial" w:hAnsi="Arial"/>
           <w:color w:val="2F75B5"/>
         </w:rPr>
         <w:lastRenderedPageBreak/>
-        <w:t>getMaintenanceQueueList()</w:t>
+        <w:t>getMaintenanceQueueList</w:t>
       </w:r>
-      <w:bookmarkEnd w:id="32"/>
+      <w:proofErr w:type="spellEnd"/>
+      <w:r>
+        <w:rPr>
+          <w:rFonts w:ascii="Arial" w:hAnsi="Arial"/>
+          <w:color w:val="2F75B5"/>
+        </w:rPr>
+        <w:t>(</w:t>
+      </w:r>
+      <w:proofErr w:type="gramEnd"/>
+      <w:r>
+        <w:rPr>
+          <w:rFonts w:ascii="Arial" w:hAnsi="Arial"/>
+          <w:color w:val="2F75B5"/>
+        </w:rPr>
+        <w:t>)</w:t>
+      </w:r>
+      <w:bookmarkEnd w:id="33"/>
     </w:p>
     <w:p>
       <w:pPr>
@@ -6622,15 +6951,24 @@
       <w:pPr>
         <w:pStyle w:val="Heading3"/>
       </w:pPr>
-      <w:bookmarkStart w:id="33" w:name="_Toc228460090"/>
+      <w:bookmarkStart w:id="34" w:name="_Toc228460090"/>
+      <w:proofErr w:type="gramStart"/>
       <w:r>
         <w:rPr>
           <w:rFonts w:ascii="Arial" w:hAnsi="Arial"/>
           <w:color w:val="2F75B5"/>
         </w:rPr>
-        <w:t>readFromCSV(String fileName)</w:t>
+        <w:t>readFromCSV(</w:t>
       </w:r>
-      <w:bookmarkEnd w:id="33"/>
+      <w:proofErr w:type="gramEnd"/>
+      <w:r>
+        <w:rPr>
+          <w:rFonts w:ascii="Arial" w:hAnsi="Arial"/>
+          <w:color w:val="2F75B5"/>
+        </w:rPr>
+        <w:t>String fileName)</w:t>
+      </w:r>
+      <w:bookmarkEnd w:id="34"/>
     </w:p>
     <w:p>
       <w:pPr>
@@ -7720,8 +8058,8 @@
       <w:pPr>
         <w:pStyle w:val="Heading2"/>
       </w:pPr>
-      <w:bookmarkStart w:id="34" w:name="_Toc228460091"/>
-      <w:bookmarkStart w:id="35" w:name="_Toc228460205"/>
+      <w:bookmarkStart w:id="35" w:name="_Toc228460091"/>
+      <w:bookmarkStart w:id="36" w:name="_Toc228464091"/>
       <w:r>
         <w:rPr>
           <w:rFonts w:ascii="Arial" w:hAnsi="Arial"/>
@@ -7729,14 +8067,14 @@
         </w:rPr>
         <w:t>Drone Class Tests</w:t>
       </w:r>
-      <w:bookmarkEnd w:id="34"/>
       <w:bookmarkEnd w:id="35"/>
+      <w:bookmarkEnd w:id="36"/>
     </w:p>
     <w:p>
       <w:pPr>
         <w:pStyle w:val="Heading3"/>
       </w:pPr>
-      <w:bookmarkStart w:id="36" w:name="_Toc228460092"/>
+      <w:bookmarkStart w:id="37" w:name="_Toc228460092"/>
       <w:r>
         <w:rPr>
           <w:rFonts w:ascii="Arial" w:hAnsi="Arial"/>
@@ -7744,7 +8082,7 @@
         </w:rPr>
         <w:t>getManufacturerName() / setManufacturerName()</w:t>
       </w:r>
-      <w:bookmarkEnd w:id="36"/>
+      <w:bookmarkEnd w:id="37"/>
     </w:p>
     <w:p>
       <w:pPr>
@@ -8024,7 +8362,7 @@
       <w:pPr>
         <w:pStyle w:val="Heading3"/>
       </w:pPr>
-      <w:bookmarkStart w:id="37" w:name="_Toc228460093"/>
+      <w:bookmarkStart w:id="38" w:name="_Toc228460093"/>
       <w:proofErr w:type="gramStart"/>
       <w:r>
         <w:rPr>
@@ -8042,7 +8380,7 @@
         </w:rPr>
         <w:t>)</w:t>
       </w:r>
-      <w:bookmarkEnd w:id="37"/>
+      <w:bookmarkEnd w:id="38"/>
     </w:p>
     <w:p>
       <w:pPr>
@@ -8241,15 +8579,24 @@
       <w:pPr>
         <w:pStyle w:val="Heading3"/>
       </w:pPr>
-      <w:bookmarkStart w:id="38" w:name="_Toc228460094"/>
+      <w:bookmarkStart w:id="39" w:name="_Toc228460094"/>
+      <w:proofErr w:type="spellStart"/>
       <w:r>
         <w:rPr>
           <w:rFonts w:ascii="Arial" w:hAnsi="Arial"/>
           <w:color w:val="2F75B5"/>
         </w:rPr>
-        <w:t>getPayloadKg()</w:t>
+        <w:t>getPayloadKg</w:t>
       </w:r>
-      <w:bookmarkEnd w:id="38"/>
+      <w:proofErr w:type="spellEnd"/>
+      <w:r>
+        <w:rPr>
+          <w:rFonts w:ascii="Arial" w:hAnsi="Arial"/>
+          <w:color w:val="2F75B5"/>
+        </w:rPr>
+        <w:t>()</w:t>
+      </w:r>
+      <w:bookmarkEnd w:id="39"/>
     </w:p>
     <w:p>
       <w:pPr>
@@ -8448,7 +8795,7 @@
       <w:pPr>
         <w:pStyle w:val="Heading3"/>
       </w:pPr>
-      <w:bookmarkStart w:id="39" w:name="_Toc228460095"/>
+      <w:bookmarkStart w:id="40" w:name="_Toc228460095"/>
       <w:r>
         <w:rPr>
           <w:rFonts w:ascii="Arial" w:hAnsi="Arial"/>
@@ -8456,7 +8803,7 @@
         </w:rPr>
         <w:t>getDroneId() / setDroneId()</w:t>
       </w:r>
-      <w:bookmarkEnd w:id="39"/>
+      <w:bookmarkEnd w:id="40"/>
     </w:p>
     <w:p>
       <w:pPr>
@@ -8731,28 +9078,36 @@
         </w:tc>
       </w:tr>
     </w:tbl>
-    <w:p/>
     <w:p>
       <w:pPr>
         <w:pStyle w:val="Heading2"/>
       </w:pPr>
-      <w:bookmarkStart w:id="40" w:name="_Toc228460096"/>
-      <w:bookmarkStart w:id="41" w:name="_Toc228460206"/>
+      <w:bookmarkStart w:id="41" w:name="_Toc228460096"/>
+      <w:bookmarkStart w:id="42" w:name="_Toc228464092"/>
+      <w:proofErr w:type="spellStart"/>
       <w:r>
         <w:rPr>
           <w:rFonts w:ascii="Arial" w:hAnsi="Arial"/>
           <w:color w:val="2F75B5"/>
         </w:rPr>
-        <w:t>PriorityDrone Class Tests</w:t>
+        <w:t>PriorityDrone</w:t>
       </w:r>
-      <w:bookmarkEnd w:id="40"/>
+      <w:proofErr w:type="spellEnd"/>
+      <w:r>
+        <w:rPr>
+          <w:rFonts w:ascii="Arial" w:hAnsi="Arial"/>
+          <w:color w:val="2F75B5"/>
+        </w:rPr>
+        <w:t xml:space="preserve"> Class Tests</w:t>
+      </w:r>
       <w:bookmarkEnd w:id="41"/>
+      <w:bookmarkEnd w:id="42"/>
     </w:p>
     <w:p>
       <w:pPr>
         <w:pStyle w:val="Heading3"/>
       </w:pPr>
-      <w:bookmarkStart w:id="42" w:name="_Toc228460097"/>
+      <w:bookmarkStart w:id="43" w:name="_Toc228460097"/>
       <w:r>
         <w:rPr>
           <w:rFonts w:ascii="Arial" w:hAnsi="Arial"/>
@@ -8760,7 +9115,7 @@
         </w:rPr>
         <w:t>Constructor and toString()</w:t>
       </w:r>
-      <w:bookmarkEnd w:id="42"/>
+      <w:bookmarkEnd w:id="43"/>
     </w:p>
     <w:p>
       <w:pPr>
@@ -9039,8 +9394,8 @@
       <w:pPr>
         <w:pStyle w:val="Heading2"/>
       </w:pPr>
-      <w:bookmarkStart w:id="43" w:name="_Toc228460098"/>
-      <w:bookmarkStart w:id="44" w:name="_Toc228460207"/>
+      <w:bookmarkStart w:id="44" w:name="_Toc228460098"/>
+      <w:bookmarkStart w:id="45" w:name="_Toc228464093"/>
       <w:proofErr w:type="spellStart"/>
       <w:r>
         <w:rPr>
@@ -9057,14 +9412,14 @@
         </w:rPr>
         <w:t xml:space="preserve"> Class Tests</w:t>
       </w:r>
-      <w:bookmarkEnd w:id="43"/>
       <w:bookmarkEnd w:id="44"/>
+      <w:bookmarkEnd w:id="45"/>
     </w:p>
     <w:p>
       <w:pPr>
         <w:pStyle w:val="Heading3"/>
       </w:pPr>
-      <w:bookmarkStart w:id="45" w:name="_Toc228460099"/>
+      <w:bookmarkStart w:id="46" w:name="_Toc228460099"/>
       <w:r>
         <w:rPr>
           <w:rFonts w:ascii="Arial" w:hAnsi="Arial"/>
@@ -9088,7 +9443,7 @@
         </w:rPr>
         <w:t>)</w:t>
       </w:r>
-      <w:bookmarkEnd w:id="45"/>
+      <w:bookmarkEnd w:id="46"/>
     </w:p>
     <w:p>
       <w:pPr>

</xml_diff>